<commit_message>
add github in report
</commit_message>
<xml_diff>
--- a/lab2/lab2.docx
+++ b/lab2/lab2.docx
@@ -1348,6 +1348,9 @@
           <w:ilvl w:val="0"/>
           <w:numId w:val="1"/>
         </w:numPr>
+        <w:rPr>
+          <w:lang w:val="en-US"/>
+        </w:rPr>
       </w:pPr>
       <w:bookmarkStart w:id="1" w:name="_lxhmd5m0i894" w:colFirst="0" w:colLast="0"/>
       <w:bookmarkEnd w:id="1"/>
@@ -1359,40 +1362,14 @@
       <w:pPr>
         <w:ind w:left="720"/>
         <w:rPr>
-          <w:rFonts w:ascii="Times New Roman" w:eastAsia="Times New Roman" w:hAnsi="Times New Roman" w:cs="Times New Roman"/>
-          <w:sz w:val="32"/>
-          <w:szCs w:val="32"/>
-          <w:shd w:val="clear" w:color="auto" w:fill="FFF2CC"/>
-        </w:rPr>
-      </w:pPr>
-      <w:r>
-        <w:rPr>
-          <w:rFonts w:ascii="Times New Roman" w:eastAsia="Times New Roman" w:hAnsi="Times New Roman" w:cs="Times New Roman"/>
-          <w:sz w:val="32"/>
-          <w:szCs w:val="32"/>
-          <w:shd w:val="clear" w:color="auto" w:fill="FFF2CC"/>
-        </w:rPr>
-        <w:t>ссылки на код, команды компиляции/ссылка на скрипт для компиляции/</w:t>
-      </w:r>
-      <w:proofErr w:type="spellStart"/>
-      <w:r>
-        <w:rPr>
-          <w:rFonts w:ascii="Times New Roman" w:eastAsia="Times New Roman" w:hAnsi="Times New Roman" w:cs="Times New Roman"/>
-          <w:sz w:val="32"/>
-          <w:szCs w:val="32"/>
-          <w:shd w:val="clear" w:color="auto" w:fill="FFF2CC"/>
-        </w:rPr>
-        <w:t>Makefile</w:t>
-      </w:r>
-      <w:proofErr w:type="spellEnd"/>
-      <w:r>
-        <w:rPr>
-          <w:rFonts w:ascii="Times New Roman" w:eastAsia="Times New Roman" w:hAnsi="Times New Roman" w:cs="Times New Roman"/>
-          <w:sz w:val="32"/>
-          <w:szCs w:val="32"/>
-          <w:shd w:val="clear" w:color="auto" w:fill="FFF2CC"/>
-        </w:rPr>
-        <w:t xml:space="preserve">/CMakeLists.txt и т. п., листинги </w:t>
+          <w:lang w:val="en-US"/>
+        </w:rPr>
+      </w:pPr>
+      <w:r>
+        <w:rPr>
+          <w:lang w:val="en-US"/>
+        </w:rPr>
+        <w:t>https://github.com/CherNuShka-825/OPP_labs/tree/lab2/lab2</w:t>
       </w:r>
     </w:p>
     <w:sectPr>
@@ -2135,6 +2112,7 @@
   <w:style w:type="character" w:default="1" w:styleId="a0">
     <w:name w:val="Default Paragraph Font"/>
     <w:uiPriority w:val="1"/>
+    <w:semiHidden/>
     <w:unhideWhenUsed/>
   </w:style>
   <w:style w:type="table" w:default="1" w:styleId="a1">

</xml_diff>